<commit_message>
Add ABCD self-reflection step-by-step guides for Ana and Andressa.
Include screen path, paste-ready reflections, 150-char Actuals, and links from call summaries.

Co-authored-by: Jonatas Andrade <jonatasandradedeveloper@users.noreply.github.com>
</commit_message>
<xml_diff>
--- a/DOCS-PEOPLE-LEAD/Ana-Karina/01-Resumo-Call.docx
+++ b/DOCS-PEOPLE-LEAD/Ana-Karina/01-Resumo-Call.docx
@@ -30,21 +30,6 @@
           <w:sz w:val="40"/>
         </w:rPr>
         <w:t>Ana Karina</w:t>
-      </w:r>
-    </w:p>
-    <w:p>
-      <w:pPr>
-        <w:jc w:val="center"/>
-      </w:pPr>
-      <w:r>
-        <w:rPr>
-          <w:rFonts w:ascii="Calibri" w:hAnsi="Calibri" w:eastAsia="Calibri"/>
-          <w:b w:val="0"/>
-          <w:i/>
-          <w:color w:val="555555"/>
-          <w:sz w:val="24"/>
-        </w:rPr>
-        <w:t>BANCO BRADESCO</w:t>
       </w:r>
     </w:p>
     <w:p/>
@@ -1270,6 +1255,149 @@
         <w:t>, pedir case de Copilot e preencher o quadro trimestre/semestre/ano.</w:t>
       </w:r>
     </w:p>
+    <w:p>
+      <w:pPr>
+        <w:pStyle w:val="Heading2"/>
+      </w:pPr>
+      <w:r>
+        <w:t>Ajuda para preencher a Autorreflexão (ABCD) — até 28/08</w:t>
+      </w:r>
+    </w:p>
+    <w:p>
+      <w:r>
+        <w:rPr>
+          <w:rFonts w:ascii="Calibri" w:hAnsi="Calibri" w:eastAsia="Calibri"/>
+          <w:b w:val="0"/>
+          <w:i w:val="0"/>
+          <w:sz w:val="22"/>
+        </w:rPr>
+        <w:t>Doc pronto com passo a passo na tela + textos para colar + Atualidade ≤150 caracteres:</w:t>
+      </w:r>
+    </w:p>
+    <w:p>
+      <w:pPr>
+        <w:pStyle w:val="ListBullet"/>
+      </w:pPr>
+      <w:r>
+        <w:rPr>
+          <w:rFonts w:ascii="Calibri" w:hAnsi="Calibri" w:eastAsia="Calibri"/>
+          <w:b w:val="0"/>
+          <w:i w:val="0"/>
+          <w:sz w:val="22"/>
+        </w:rPr>
+        <w:t xml:space="preserve">Markdown: </w:t>
+      </w:r>
+      <w:r>
+        <w:rPr>
+          <w:rFonts w:ascii="Consolas" w:hAnsi="Consolas" w:eastAsia="Consolas"/>
+          <w:b w:val="0"/>
+          <w:i w:val="0"/>
+          <w:color w:val="333333"/>
+          <w:sz w:val="18"/>
+        </w:rPr>
+        <w:t>people-lead/ana/09-autorreflexao-passo-a-passo.md</w:t>
+      </w:r>
+    </w:p>
+    <w:p>
+      <w:pPr>
+        <w:pStyle w:val="ListBullet"/>
+      </w:pPr>
+      <w:r>
+        <w:rPr>
+          <w:rFonts w:ascii="Calibri" w:hAnsi="Calibri" w:eastAsia="Calibri"/>
+          <w:b w:val="0"/>
+          <w:i w:val="0"/>
+          <w:sz w:val="22"/>
+        </w:rPr>
+        <w:t xml:space="preserve">Word: </w:t>
+      </w:r>
+      <w:r>
+        <w:rPr>
+          <w:rFonts w:ascii="Consolas" w:hAnsi="Consolas" w:eastAsia="Consolas"/>
+          <w:b w:val="0"/>
+          <w:i w:val="0"/>
+          <w:color w:val="333333"/>
+          <w:sz w:val="18"/>
+        </w:rPr>
+        <w:t>DOCS-PEOPLE-LEAD/Ana-Karina/05-Autorreflexao-passo-a-passo.docx</w:t>
+      </w:r>
+    </w:p>
+    <w:p>
+      <w:r>
+        <w:rPr>
+          <w:rFonts w:ascii="Calibri" w:hAnsi="Calibri" w:eastAsia="Calibri"/>
+          <w:b w:val="0"/>
+          <w:i w:val="0"/>
+          <w:sz w:val="22"/>
+        </w:rPr>
+        <w:t xml:space="preserve">Resumo do caminho: Priorities Homepage → </w:t>
+      </w:r>
+      <w:r>
+        <w:rPr>
+          <w:rFonts w:ascii="Calibri" w:hAnsi="Calibri" w:eastAsia="Calibri"/>
+          <w:b/>
+          <w:i w:val="0"/>
+          <w:sz w:val="22"/>
+        </w:rPr>
+        <w:t>Edit &gt;</w:t>
+      </w:r>
+      <w:r>
+        <w:rPr>
+          <w:rFonts w:ascii="Calibri" w:hAnsi="Calibri" w:eastAsia="Calibri"/>
+          <w:b w:val="0"/>
+          <w:i w:val="0"/>
+          <w:sz w:val="22"/>
+        </w:rPr>
+        <w:t xml:space="preserve"> → </w:t>
+      </w:r>
+      <w:r>
+        <w:rPr>
+          <w:rFonts w:ascii="Calibri" w:hAnsi="Calibri" w:eastAsia="Calibri"/>
+          <w:b/>
+          <w:i w:val="0"/>
+          <w:sz w:val="22"/>
+        </w:rPr>
+        <w:t>Submeta e Refleta</w:t>
+      </w:r>
+      <w:r>
+        <w:rPr>
+          <w:rFonts w:ascii="Calibri" w:hAnsi="Calibri" w:eastAsia="Calibri"/>
+          <w:b w:val="0"/>
+          <w:i w:val="0"/>
+          <w:sz w:val="22"/>
+        </w:rPr>
+        <w:t xml:space="preserve"> → colar reflexão → slider → Atualidade (máx. 150) → </w:t>
+      </w:r>
+      <w:r>
+        <w:rPr>
+          <w:rFonts w:ascii="Calibri" w:hAnsi="Calibri" w:eastAsia="Calibri"/>
+          <w:b/>
+          <w:i w:val="0"/>
+          <w:sz w:val="22"/>
+        </w:rPr>
+        <w:t>Enviar</w:t>
+      </w:r>
+      <w:r>
+        <w:rPr>
+          <w:rFonts w:ascii="Calibri" w:hAnsi="Calibri" w:eastAsia="Calibri"/>
+          <w:b w:val="0"/>
+          <w:i w:val="0"/>
+          <w:sz w:val="22"/>
+        </w:rPr>
+        <w:t>.</w:t>
+      </w:r>
+    </w:p>
+    <w:p>
+      <w:r>
+        <w:rPr>
+          <w:rFonts w:ascii="Calibri" w:hAnsi="Calibri" w:eastAsia="Calibri"/>
+          <w:b w:val="0"/>
+          <w:i w:val="0"/>
+          <w:sz w:val="22"/>
+        </w:rPr>
+        <w:t>Agrupe as 7 metas em 4 categorias antes de refletir.</w:t>
+      </w:r>
+    </w:p>
     <w:sectPr>
       <w:footerReference w:type="default" r:id="rId9"/>
       <w:pgSz w:w="12240" w:h="15840"/>

</xml_diff>

<commit_message>
Atualizar docs da Ana Karina após 1:1 #2 (28/08)
Registra segunda call: homologação do app Bradesco, agentes Copilot/IA,
Swift estendido para FY27, orientação Workday ABCD e feedback Jessica.
Inclui resumo call 2, histórico, ficha, prioridades, ações e Word atualizado.

Co-authored-by: Jonatas Andrade <jonatasandradedeveloper@users.noreply.github.com>
</commit_message>
<xml_diff>
--- a/DOCS-PEOPLE-LEAD/Ana-Karina/01-Resumo-Call.docx
+++ b/DOCS-PEOPLE-LEAD/Ana-Karina/01-Resumo-Call.docx
@@ -4,72 +4,47 @@
   <w:body>
     <w:p>
       <w:pPr>
-        <w:jc w:val="center"/>
+        <w:jc w:val="left"/>
       </w:pPr>
       <w:r>
         <w:rPr>
-          <w:rFonts w:ascii="Calibri" w:hAnsi="Calibri" w:eastAsia="Calibri"/>
           <w:b/>
-          <w:i w:val="0"/>
           <w:color w:val="1F3A5F"/>
-          <w:sz w:val="22"/>
+          <w:sz w:val="40"/>
         </w:rPr>
-        <w:t>RESUMO DA 1:1 #1 · 28/07/2026</w:t>
+        <w:t>Resumo da call — Ana Karina</w:t>
       </w:r>
     </w:p>
     <w:p>
-      <w:pPr>
-        <w:jc w:val="center"/>
-      </w:pPr>
       <w:r>
         <w:rPr>
-          <w:rFonts w:ascii="Calibri" w:hAnsi="Calibri" w:eastAsia="Calibri"/>
-          <w:b/>
-          <w:i w:val="0"/>
-          <w:color w:val="1F3A5F"/>
-          <w:sz w:val="40"/>
+          <w:i/>
+          <w:color w:val="555555"/>
+          <w:sz w:val="22"/>
         </w:rPr>
-        <w:t>Ana Karina</w:t>
+        <w:t>Ana Karina · People Lead · documento editável</w:t>
       </w:r>
     </w:p>
     <w:p/>
     <w:p>
       <w:r>
         <w:rPr>
-          <w:rFonts w:ascii="Calibri" w:hAnsi="Calibri" w:eastAsia="Calibri"/>
           <w:b/>
-          <w:i w:val="0"/>
-          <w:sz w:val="22"/>
         </w:rPr>
         <w:t>1:1 #1 · 28/07/2026</w:t>
       </w:r>
     </w:p>
     <w:p>
       <w:r>
-        <w:rPr>
-          <w:rFonts w:ascii="Calibri" w:hAnsi="Calibri" w:eastAsia="Calibri"/>
-          <w:b w:val="0"/>
-          <w:i w:val="0"/>
-          <w:sz w:val="22"/>
-        </w:rPr>
         <w:t xml:space="preserve">People Lead: Jônatas · Cliente: </w:t>
       </w:r>
       <w:r>
         <w:rPr>
-          <w:rFonts w:ascii="Calibri" w:hAnsi="Calibri" w:eastAsia="Calibri"/>
           <w:b/>
-          <w:i w:val="0"/>
-          <w:sz w:val="22"/>
         </w:rPr>
         <w:t>BANCO BRADESCO</w:t>
       </w:r>
       <w:r>
-        <w:rPr>
-          <w:rFonts w:ascii="Calibri" w:hAnsi="Calibri" w:eastAsia="Calibri"/>
-          <w:b w:val="0"/>
-          <w:i w:val="0"/>
-          <w:sz w:val="22"/>
-        </w:rPr>
         <w:t xml:space="preserve"> · Cargo: Associate, Mobile &amp; Device Dev</w:t>
       </w:r>
     </w:p>
@@ -90,84 +65,42 @@
     </w:p>
     <w:p>
       <w:r>
-        <w:rPr>
-          <w:rFonts w:ascii="Calibri" w:hAnsi="Calibri" w:eastAsia="Calibri"/>
-          <w:b w:val="0"/>
-          <w:i w:val="0"/>
-          <w:sz w:val="22"/>
-        </w:rPr>
         <w:t xml:space="preserve">Primeira conversa após a troca de CA: Ana está </w:t>
       </w:r>
       <w:r>
         <w:rPr>
-          <w:rFonts w:ascii="Calibri" w:hAnsi="Calibri" w:eastAsia="Calibri"/>
           <w:b/>
-          <w:i w:val="0"/>
-          <w:sz w:val="22"/>
         </w:rPr>
         <w:t>motivada no Bradesco</w:t>
       </w:r>
       <w:r>
-        <w:rPr>
-          <w:rFonts w:ascii="Calibri" w:hAnsi="Calibri" w:eastAsia="Calibri"/>
-          <w:b w:val="0"/>
-          <w:i w:val="0"/>
-          <w:sz w:val="22"/>
-        </w:rPr>
         <w:t xml:space="preserve">, já usa </w:t>
       </w:r>
       <w:r>
         <w:rPr>
-          <w:rFonts w:ascii="Calibri" w:hAnsi="Calibri" w:eastAsia="Calibri"/>
           <w:b/>
-          <w:i w:val="0"/>
-          <w:sz w:val="22"/>
         </w:rPr>
         <w:t>Copilot/IA de verdade</w:t>
       </w:r>
       <w:r>
-        <w:rPr>
-          <w:rFonts w:ascii="Calibri" w:hAnsi="Calibri" w:eastAsia="Calibri"/>
-          <w:b w:val="0"/>
-          <w:i w:val="0"/>
-          <w:sz w:val="22"/>
-        </w:rPr>
         <w:t xml:space="preserve"> no app, tem norte claro de </w:t>
       </w:r>
       <w:r>
         <w:rPr>
-          <w:rFonts w:ascii="Calibri" w:hAnsi="Calibri" w:eastAsia="Calibri"/>
           <w:b/>
-          <w:i w:val="0"/>
-          <w:sz w:val="22"/>
         </w:rPr>
         <w:t>arquitetura mobile</w:t>
       </w:r>
       <w:r>
-        <w:rPr>
-          <w:rFonts w:ascii="Calibri" w:hAnsi="Calibri" w:eastAsia="Calibri"/>
-          <w:b w:val="0"/>
-          <w:i w:val="0"/>
-          <w:sz w:val="22"/>
-        </w:rPr>
         <w:t xml:space="preserve">, e o gargalo é </w:t>
       </w:r>
       <w:r>
         <w:rPr>
-          <w:rFonts w:ascii="Calibri" w:hAnsi="Calibri" w:eastAsia="Calibri"/>
           <w:b/>
-          <w:i w:val="0"/>
-          <w:sz w:val="22"/>
         </w:rPr>
         <w:t>tempo/foco</w:t>
       </w:r>
       <w:r>
-        <w:rPr>
-          <w:rFonts w:ascii="Calibri" w:hAnsi="Calibri" w:eastAsia="Calibri"/>
-          <w:b w:val="0"/>
-          <w:i w:val="0"/>
-          <w:sz w:val="22"/>
-        </w:rPr>
         <w:t xml:space="preserve"> (faculdade presencial) — não desmotivação.</w:t>
       </w:r>
     </w:p>
@@ -184,12 +117,6 @@
         <w:pStyle w:val="ListBullet"/>
       </w:pPr>
       <w:r>
-        <w:rPr>
-          <w:rFonts w:ascii="Calibri" w:hAnsi="Calibri" w:eastAsia="Calibri"/>
-          <w:b w:val="0"/>
-          <w:i w:val="0"/>
-          <w:sz w:val="22"/>
-        </w:rPr>
         <w:t>Apresentação do novo People Lead (antes: Paula).</w:t>
       </w:r>
     </w:p>
@@ -198,12 +125,6 @@
         <w:pStyle w:val="ListBullet"/>
       </w:pPr>
       <w:r>
-        <w:rPr>
-          <w:rFonts w:ascii="Calibri" w:hAnsi="Calibri" w:eastAsia="Calibri"/>
-          <w:b w:val="0"/>
-          <w:i w:val="0"/>
-          <w:sz w:val="22"/>
-        </w:rPr>
         <w:t>Começo atropelado (entrega no time / contexto Recife).</w:t>
       </w:r>
     </w:p>
@@ -212,30 +133,15 @@
         <w:pStyle w:val="ListBullet"/>
       </w:pPr>
       <w:r>
-        <w:rPr>
-          <w:rFonts w:ascii="Calibri" w:hAnsi="Calibri" w:eastAsia="Calibri"/>
-          <w:b w:val="0"/>
-          <w:i w:val="0"/>
-          <w:sz w:val="22"/>
-        </w:rPr>
         <w:t xml:space="preserve">Cadência combinada: </w:t>
       </w:r>
       <w:r>
         <w:rPr>
-          <w:rFonts w:ascii="Calibri" w:hAnsi="Calibri" w:eastAsia="Calibri"/>
           <w:b/>
-          <w:i w:val="0"/>
-          <w:sz w:val="22"/>
         </w:rPr>
         <w:t>1x por mês</w:t>
       </w:r>
       <w:r>
-        <w:rPr>
-          <w:rFonts w:ascii="Calibri" w:hAnsi="Calibri" w:eastAsia="Calibri"/>
-          <w:b w:val="0"/>
-          <w:i w:val="0"/>
-          <w:sz w:val="22"/>
-        </w:rPr>
         <w:t xml:space="preserve"> (com Paula era ~bimestral, mas com plano T/S/A).</w:t>
       </w:r>
     </w:p>
@@ -244,12 +150,6 @@
         <w:pStyle w:val="ListBullet"/>
       </w:pPr>
       <w:r>
-        <w:rPr>
-          <w:rFonts w:ascii="Calibri" w:hAnsi="Calibri" w:eastAsia="Calibri"/>
-          <w:b w:val="0"/>
-          <w:i w:val="0"/>
-          <w:sz w:val="22"/>
-        </w:rPr>
         <w:t>Objetivo: conhecer, alinhar expectativa e recriar o rito de planejamento.</w:t>
       </w:r>
     </w:p>
@@ -266,30 +166,15 @@
         <w:pStyle w:val="ListBullet"/>
       </w:pPr>
       <w:r>
-        <w:rPr>
-          <w:rFonts w:ascii="Calibri" w:hAnsi="Calibri" w:eastAsia="Calibri"/>
-          <w:b w:val="0"/>
-          <w:i w:val="0"/>
-          <w:sz w:val="22"/>
-        </w:rPr>
         <w:t xml:space="preserve">App nativo novo; atua em </w:t>
       </w:r>
       <w:r>
         <w:rPr>
-          <w:rFonts w:ascii="Calibri" w:hAnsi="Calibri" w:eastAsia="Calibri"/>
           <w:b/>
-          <w:i w:val="0"/>
-          <w:sz w:val="22"/>
         </w:rPr>
         <w:t>Kotlin / Android</w:t>
       </w:r>
       <w:r>
-        <w:rPr>
-          <w:rFonts w:ascii="Calibri" w:hAnsi="Calibri" w:eastAsia="Calibri"/>
-          <w:b w:val="0"/>
-          <w:i w:val="0"/>
-          <w:sz w:val="22"/>
-        </w:rPr>
         <w:t>.</w:t>
       </w:r>
     </w:p>
@@ -298,12 +183,6 @@
         <w:pStyle w:val="ListBullet"/>
       </w:pPr>
       <w:r>
-        <w:rPr>
-          <w:rFonts w:ascii="Calibri" w:hAnsi="Calibri" w:eastAsia="Calibri"/>
-          <w:b w:val="0"/>
-          <w:i w:val="0"/>
-          <w:sz w:val="22"/>
-        </w:rPr>
         <w:t>Aprendeu a linguagem junto com a evolução do produto.</w:t>
       </w:r>
     </w:p>
@@ -312,12 +191,6 @@
         <w:pStyle w:val="ListBullet"/>
       </w:pPr>
       <w:r>
-        <w:rPr>
-          <w:rFonts w:ascii="Calibri" w:hAnsi="Calibri" w:eastAsia="Calibri"/>
-          <w:b w:val="0"/>
-          <w:i w:val="0"/>
-          <w:sz w:val="22"/>
-        </w:rPr>
         <w:t>Gosta muito do time e do projeto.</w:t>
       </w:r>
     </w:p>
@@ -326,30 +199,15 @@
         <w:pStyle w:val="ListBullet"/>
       </w:pPr>
       <w:r>
-        <w:rPr>
-          <w:rFonts w:ascii="Calibri" w:hAnsi="Calibri" w:eastAsia="Calibri"/>
-          <w:b w:val="0"/>
-          <w:i w:val="0"/>
-          <w:sz w:val="22"/>
-        </w:rPr>
         <w:t xml:space="preserve">Já usa </w:t>
       </w:r>
       <w:r>
         <w:rPr>
-          <w:rFonts w:ascii="Calibri" w:hAnsi="Calibri" w:eastAsia="Calibri"/>
           <w:b/>
-          <w:i w:val="0"/>
-          <w:sz w:val="22"/>
         </w:rPr>
         <w:t>Copilot</w:t>
       </w:r>
       <w:r>
-        <w:rPr>
-          <w:rFonts w:ascii="Calibri" w:hAnsi="Calibri" w:eastAsia="Calibri"/>
-          <w:b w:val="0"/>
-          <w:i w:val="0"/>
-          <w:sz w:val="22"/>
-        </w:rPr>
         <w:t xml:space="preserve"> no fluxo: prompts, agente de acessibilidade, otimização de token.</w:t>
       </w:r>
     </w:p>
@@ -358,30 +216,15 @@
         <w:pStyle w:val="ListBullet"/>
       </w:pPr>
       <w:r>
-        <w:rPr>
-          <w:rFonts w:ascii="Calibri" w:hAnsi="Calibri" w:eastAsia="Calibri"/>
-          <w:b w:val="0"/>
-          <w:i w:val="0"/>
-          <w:sz w:val="22"/>
-        </w:rPr>
         <w:t xml:space="preserve">Quer prompt que sirva para Android </w:t>
       </w:r>
       <w:r>
         <w:rPr>
-          <w:rFonts w:ascii="Calibri" w:hAnsi="Calibri" w:eastAsia="Calibri"/>
           <w:b/>
-          <w:i w:val="0"/>
-          <w:sz w:val="22"/>
         </w:rPr>
         <w:t>e</w:t>
       </w:r>
       <w:r>
-        <w:rPr>
-          <w:rFonts w:ascii="Calibri" w:hAnsi="Calibri" w:eastAsia="Calibri"/>
-          <w:b w:val="0"/>
-          <w:i w:val="0"/>
-          <w:sz w:val="22"/>
-        </w:rPr>
         <w:t xml:space="preserve"> para a metade iOS.</w:t>
       </w:r>
     </w:p>
@@ -390,12 +233,6 @@
         <w:pStyle w:val="ListBullet"/>
       </w:pPr>
       <w:r>
-        <w:rPr>
-          <w:rFonts w:ascii="Calibri" w:hAnsi="Calibri" w:eastAsia="Calibri"/>
-          <w:b w:val="0"/>
-          <w:i w:val="0"/>
-          <w:sz w:val="22"/>
-        </w:rPr>
         <w:t>Faculdade presencial → priorizou cliente em vez de certificação no curto prazo.</w:t>
       </w:r>
     </w:p>
@@ -404,30 +241,15 @@
         <w:pStyle w:val="ListBullet"/>
       </w:pPr>
       <w:r>
-        <w:rPr>
-          <w:rFonts w:ascii="Calibri" w:hAnsi="Calibri" w:eastAsia="Calibri"/>
-          <w:b w:val="0"/>
-          <w:i w:val="0"/>
-          <w:sz w:val="22"/>
-        </w:rPr>
         <w:t xml:space="preserve">Gestor: </w:t>
       </w:r>
       <w:r>
         <w:rPr>
-          <w:rFonts w:ascii="Calibri" w:hAnsi="Calibri" w:eastAsia="Calibri"/>
           <w:b/>
-          <w:i w:val="0"/>
-          <w:sz w:val="22"/>
         </w:rPr>
         <w:t>Rafael</w:t>
       </w:r>
       <w:r>
-        <w:rPr>
-          <w:rFonts w:ascii="Calibri" w:hAnsi="Calibri" w:eastAsia="Calibri"/>
-          <w:b w:val="0"/>
-          <w:i w:val="0"/>
-          <w:sz w:val="22"/>
-        </w:rPr>
         <w:t>.</w:t>
       </w:r>
     </w:p>
@@ -465,9 +287,7 @@
             </w:r>
             <w:r>
               <w:rPr>
-                <w:rFonts w:ascii="Calibri" w:hAnsi="Calibri" w:eastAsia="Calibri"/>
                 <w:b/>
-                <w:i w:val="0"/>
                 <w:color w:val="FFFFFF"/>
                 <w:sz w:val="20"/>
               </w:rPr>
@@ -490,9 +310,7 @@
             </w:r>
             <w:r>
               <w:rPr>
-                <w:rFonts w:ascii="Calibri" w:hAnsi="Calibri" w:eastAsia="Calibri"/>
                 <w:b/>
-                <w:i w:val="0"/>
                 <w:color w:val="FFFFFF"/>
                 <w:sz w:val="20"/>
               </w:rPr>
@@ -514,9 +332,6 @@
             </w:r>
             <w:r>
               <w:rPr>
-                <w:rFonts w:ascii="Calibri" w:hAnsi="Calibri" w:eastAsia="Calibri"/>
-                <w:b w:val="0"/>
-                <w:i w:val="0"/>
                 <w:sz w:val="20"/>
               </w:rPr>
               <w:t>Norte</w:t>
@@ -535,9 +350,6 @@
             </w:r>
             <w:r>
               <w:rPr>
-                <w:rFonts w:ascii="Calibri" w:hAnsi="Calibri" w:eastAsia="Calibri"/>
-                <w:b w:val="0"/>
-                <w:i w:val="0"/>
                 <w:sz w:val="20"/>
               </w:rPr>
               <w:t>Arquitetura mobile / arquitetura de solução</w:t>
@@ -559,9 +371,6 @@
             </w:r>
             <w:r>
               <w:rPr>
-                <w:rFonts w:ascii="Calibri" w:hAnsi="Calibri" w:eastAsia="Calibri"/>
-                <w:b w:val="0"/>
-                <w:i w:val="0"/>
                 <w:sz w:val="20"/>
               </w:rPr>
               <w:t>Certificação IA</w:t>
@@ -581,9 +390,6 @@
             </w:r>
             <w:r>
               <w:rPr>
-                <w:rFonts w:ascii="Calibri" w:hAnsi="Calibri" w:eastAsia="Calibri"/>
-                <w:b w:val="0"/>
-                <w:i w:val="0"/>
                 <w:sz w:val="20"/>
               </w:rPr>
               <w:t>Importante no longo prazo; adiada agora</w:t>
@@ -604,9 +410,6 @@
             </w:r>
             <w:r>
               <w:rPr>
-                <w:rFonts w:ascii="Calibri" w:hAnsi="Calibri" w:eastAsia="Calibri"/>
-                <w:b w:val="0"/>
-                <w:i w:val="0"/>
                 <w:sz w:val="20"/>
               </w:rPr>
               <w:t>Swift / iOS</w:t>
@@ -625,18 +428,13 @@
             </w:r>
             <w:r>
               <w:rPr>
-                <w:rFonts w:ascii="Calibri" w:hAnsi="Calibri" w:eastAsia="Calibri"/>
-                <w:b w:val="0"/>
-                <w:i w:val="0"/>
                 <w:sz w:val="20"/>
               </w:rPr>
               <w:t xml:space="preserve">Começou, gostou, falta Mac/tempo; </w:t>
             </w:r>
             <w:r>
               <w:rPr>
-                <w:rFonts w:ascii="Calibri" w:hAnsi="Calibri" w:eastAsia="Calibri"/>
                 <w:b/>
-                <w:i w:val="0"/>
                 <w:sz w:val="20"/>
               </w:rPr>
               <w:t>não abandonou</w:t>
@@ -658,9 +456,6 @@
             </w:r>
             <w:r>
               <w:rPr>
-                <w:rFonts w:ascii="Calibri" w:hAnsi="Calibri" w:eastAsia="Calibri"/>
-                <w:b w:val="0"/>
-                <w:i w:val="0"/>
                 <w:sz w:val="20"/>
               </w:rPr>
               <w:t>Inglês</w:t>
@@ -680,18 +475,13 @@
             </w:r>
             <w:r>
               <w:rPr>
-                <w:rFonts w:ascii="Calibri" w:hAnsi="Calibri" w:eastAsia="Calibri"/>
                 <w:b/>
-                <w:i w:val="0"/>
                 <w:sz w:val="20"/>
               </w:rPr>
               <w:t>B2 → C1+</w:t>
             </w:r>
             <w:r>
               <w:rPr>
-                <w:rFonts w:ascii="Calibri" w:hAnsi="Calibri" w:eastAsia="Calibri"/>
-                <w:b w:val="0"/>
-                <w:i w:val="0"/>
                 <w:sz w:val="20"/>
               </w:rPr>
               <w:t xml:space="preserve"> no goFluent (já entregue)</w:t>
@@ -712,9 +502,6 @@
             </w:r>
             <w:r>
               <w:rPr>
-                <w:rFonts w:ascii="Calibri" w:hAnsi="Calibri" w:eastAsia="Calibri"/>
-                <w:b w:val="0"/>
-                <w:i w:val="0"/>
                 <w:sz w:val="20"/>
               </w:rPr>
               <w:t>Com a Paula</w:t>
@@ -733,9 +520,6 @@
             </w:r>
             <w:r>
               <w:rPr>
-                <w:rFonts w:ascii="Calibri" w:hAnsi="Calibri" w:eastAsia="Calibri"/>
-                <w:b w:val="0"/>
-                <w:i w:val="0"/>
                 <w:sz w:val="20"/>
               </w:rPr>
               <w:t>Metas de trimestre / semestre / ano — quer manter esse rito</w:t>
@@ -757,9 +541,6 @@
             </w:r>
             <w:r>
               <w:rPr>
-                <w:rFonts w:ascii="Calibri" w:hAnsi="Calibri" w:eastAsia="Calibri"/>
-                <w:b w:val="0"/>
-                <w:i w:val="0"/>
                 <w:sz w:val="20"/>
               </w:rPr>
               <w:t>Outros</w:t>
@@ -779,9 +560,6 @@
             </w:r>
             <w:r>
               <w:rPr>
-                <w:rFonts w:ascii="Calibri" w:hAnsi="Calibri" w:eastAsia="Calibri"/>
-                <w:b w:val="0"/>
-                <w:i w:val="0"/>
                 <w:sz w:val="20"/>
               </w:rPr>
               <w:t>Curiosidade sobre jornada mobile → consultoria/decisão</w:t>
@@ -804,12 +582,6 @@
         <w:pStyle w:val="ListBullet"/>
       </w:pPr>
       <w:r>
-        <w:rPr>
-          <w:rFonts w:ascii="Calibri" w:hAnsi="Calibri" w:eastAsia="Calibri"/>
-          <w:b w:val="0"/>
-          <w:i w:val="0"/>
-          <w:sz w:val="22"/>
-        </w:rPr>
         <w:t>Compliance: tinha adiantado; ia conferir se entrou item novo.</w:t>
       </w:r>
     </w:p>
@@ -818,12 +590,6 @@
         <w:pStyle w:val="ListBullet"/>
       </w:pPr>
       <w:r>
-        <w:rPr>
-          <w:rFonts w:ascii="Calibri" w:hAnsi="Calibri" w:eastAsia="Calibri"/>
-          <w:b w:val="0"/>
-          <w:i w:val="0"/>
-          <w:sz w:val="22"/>
-        </w:rPr>
         <w:t>Canal no chat aberto (PL pode demorar se estiver em entrega no próprio projeto).</w:t>
       </w:r>
     </w:p>
@@ -861,9 +627,7 @@
             </w:r>
             <w:r>
               <w:rPr>
-                <w:rFonts w:ascii="Calibri" w:hAnsi="Calibri" w:eastAsia="Calibri"/>
                 <w:b/>
-                <w:i w:val="0"/>
                 <w:color w:val="FFFFFF"/>
                 <w:sz w:val="20"/>
               </w:rPr>
@@ -886,9 +650,7 @@
             </w:r>
             <w:r>
               <w:rPr>
-                <w:rFonts w:ascii="Calibri" w:hAnsi="Calibri" w:eastAsia="Calibri"/>
                 <w:b/>
-                <w:i w:val="0"/>
                 <w:color w:val="FFFFFF"/>
                 <w:sz w:val="20"/>
               </w:rPr>
@@ -910,9 +672,6 @@
             </w:r>
             <w:r>
               <w:rPr>
-                <w:rFonts w:ascii="Calibri" w:hAnsi="Calibri" w:eastAsia="Calibri"/>
-                <w:b w:val="0"/>
-                <w:i w:val="0"/>
                 <w:sz w:val="20"/>
               </w:rPr>
               <w:t>1:1 mensal</w:t>
@@ -931,9 +690,6 @@
             </w:r>
             <w:r>
               <w:rPr>
-                <w:rFonts w:ascii="Calibri" w:hAnsi="Calibri" w:eastAsia="Calibri"/>
-                <w:b w:val="0"/>
-                <w:i w:val="0"/>
                 <w:sz w:val="20"/>
               </w:rPr>
               <w:t>Combinado</w:t>
@@ -955,9 +711,6 @@
             </w:r>
             <w:r>
               <w:rPr>
-                <w:rFonts w:ascii="Calibri" w:hAnsi="Calibri" w:eastAsia="Calibri"/>
-                <w:b w:val="0"/>
-                <w:i w:val="0"/>
                 <w:sz w:val="20"/>
               </w:rPr>
               <w:t>Dados/e-mail da Paula</w:t>
@@ -977,9 +730,6 @@
             </w:r>
             <w:r>
               <w:rPr>
-                <w:rFonts w:ascii="Calibri" w:hAnsi="Calibri" w:eastAsia="Calibri"/>
-                <w:b w:val="0"/>
-                <w:i w:val="0"/>
                 <w:sz w:val="20"/>
               </w:rPr>
               <w:t>Pendente (confirmar)</w:t>
@@ -1000,9 +750,6 @@
             </w:r>
             <w:r>
               <w:rPr>
-                <w:rFonts w:ascii="Calibri" w:hAnsi="Calibri" w:eastAsia="Calibri"/>
-                <w:b w:val="0"/>
-                <w:i w:val="0"/>
                 <w:sz w:val="20"/>
               </w:rPr>
               <w:t>Planejamento T/S/A</w:t>
@@ -1021,9 +768,6 @@
             </w:r>
             <w:r>
               <w:rPr>
-                <w:rFonts w:ascii="Calibri" w:hAnsi="Calibri" w:eastAsia="Calibri"/>
-                <w:b w:val="0"/>
-                <w:i w:val="0"/>
                 <w:sz w:val="20"/>
               </w:rPr>
               <w:t>Pendente → pauta da #2</w:t>
@@ -1045,9 +789,6 @@
             </w:r>
             <w:r>
               <w:rPr>
-                <w:rFonts w:ascii="Calibri" w:hAnsi="Calibri" w:eastAsia="Calibri"/>
-                <w:b w:val="0"/>
-                <w:i w:val="0"/>
                 <w:sz w:val="20"/>
               </w:rPr>
               <w:t>Conferir compliance</w:t>
@@ -1067,9 +808,6 @@
             </w:r>
             <w:r>
               <w:rPr>
-                <w:rFonts w:ascii="Calibri" w:hAnsi="Calibri" w:eastAsia="Calibri"/>
-                <w:b w:val="0"/>
-                <w:i w:val="0"/>
                 <w:sz w:val="20"/>
               </w:rPr>
               <w:t>Pendente</w:t>
@@ -1090,9 +828,6 @@
             </w:r>
             <w:r>
               <w:rPr>
-                <w:rFonts w:ascii="Calibri" w:hAnsi="Calibri" w:eastAsia="Calibri"/>
-                <w:b w:val="0"/>
-                <w:i w:val="0"/>
                 <w:sz w:val="20"/>
               </w:rPr>
               <w:t>Material Flutter ↔ nativo (interesse)</w:t>
@@ -1111,9 +846,6 @@
             </w:r>
             <w:r>
               <w:rPr>
-                <w:rFonts w:ascii="Calibri" w:hAnsi="Calibri" w:eastAsia="Calibri"/>
-                <w:b w:val="0"/>
-                <w:i w:val="0"/>
                 <w:sz w:val="20"/>
               </w:rPr>
               <w:t>Opcional, não é ciclo</w:t>
@@ -1136,12 +868,6 @@
         <w:pStyle w:val="ListBullet"/>
       </w:pPr>
       <w:r>
-        <w:rPr>
-          <w:rFonts w:ascii="Calibri" w:hAnsi="Calibri" w:eastAsia="Calibri"/>
-          <w:b w:val="0"/>
-          <w:i w:val="0"/>
-          <w:sz w:val="22"/>
-        </w:rPr>
         <w:t>Está no projeto certo para o momento (energia oposta à da Andressa).</w:t>
       </w:r>
     </w:p>
@@ -1150,30 +876,15 @@
         <w:pStyle w:val="ListBullet"/>
       </w:pPr>
       <w:r>
-        <w:rPr>
-          <w:rFonts w:ascii="Calibri" w:hAnsi="Calibri" w:eastAsia="Calibri"/>
-          <w:b w:val="0"/>
-          <w:i w:val="0"/>
-          <w:sz w:val="22"/>
-        </w:rPr>
         <w:t xml:space="preserve">Diferencial real: </w:t>
       </w:r>
       <w:r>
         <w:rPr>
-          <w:rFonts w:ascii="Calibri" w:hAnsi="Calibri" w:eastAsia="Calibri"/>
           <w:b/>
-          <w:i w:val="0"/>
-          <w:sz w:val="22"/>
         </w:rPr>
         <w:t>Copilot aplicado</w:t>
       </w:r>
       <w:r>
-        <w:rPr>
-          <w:rFonts w:ascii="Calibri" w:hAnsi="Calibri" w:eastAsia="Calibri"/>
-          <w:b w:val="0"/>
-          <w:i w:val="0"/>
-          <w:sz w:val="22"/>
-        </w:rPr>
         <w:t xml:space="preserve"> — precisa virar evidência no Workday.</w:t>
       </w:r>
     </w:p>
@@ -1182,30 +893,15 @@
         <w:pStyle w:val="ListBullet"/>
       </w:pPr>
       <w:r>
-        <w:rPr>
-          <w:rFonts w:ascii="Calibri" w:hAnsi="Calibri" w:eastAsia="Calibri"/>
-          <w:b w:val="0"/>
-          <w:i w:val="0"/>
-          <w:sz w:val="22"/>
-        </w:rPr>
         <w:t xml:space="preserve">Risco: </w:t>
       </w:r>
       <w:r>
         <w:rPr>
-          <w:rFonts w:ascii="Calibri" w:hAnsi="Calibri" w:eastAsia="Calibri"/>
           <w:b/>
-          <w:i w:val="0"/>
-          <w:sz w:val="22"/>
         </w:rPr>
         <w:t>7 prioridades</w:t>
       </w:r>
       <w:r>
-        <w:rPr>
-          <w:rFonts w:ascii="Calibri" w:hAnsi="Calibri" w:eastAsia="Calibri"/>
-          <w:b w:val="0"/>
-          <w:i w:val="0"/>
-          <w:sz w:val="22"/>
-        </w:rPr>
         <w:t xml:space="preserve"> diluem o que já é forte.</w:t>
       </w:r>
     </w:p>
@@ -1214,12 +910,6 @@
         <w:pStyle w:val="ListBullet"/>
       </w:pPr>
       <w:r>
-        <w:rPr>
-          <w:rFonts w:ascii="Calibri" w:hAnsi="Calibri" w:eastAsia="Calibri"/>
-          <w:b w:val="0"/>
-          <w:i w:val="0"/>
-          <w:sz w:val="22"/>
-        </w:rPr>
         <w:t>Este FY: consolidar Associate excelente; Analyst/arquitetura/Swift no FY27.</w:t>
       </w:r>
     </w:p>
@@ -1228,31 +918,50 @@
         <w:pStyle w:val="ListBullet"/>
       </w:pPr>
       <w:r>
-        <w:rPr>
-          <w:rFonts w:ascii="Calibri" w:hAnsi="Calibri" w:eastAsia="Calibri"/>
-          <w:b w:val="0"/>
-          <w:i w:val="0"/>
-          <w:sz w:val="22"/>
-        </w:rPr>
         <w:t xml:space="preserve">Próxima call deve </w:t>
       </w:r>
       <w:r>
         <w:rPr>
-          <w:rFonts w:ascii="Calibri" w:hAnsi="Calibri" w:eastAsia="Calibri"/>
           <w:b/>
-          <w:i w:val="0"/>
-          <w:sz w:val="22"/>
         </w:rPr>
         <w:t>recortar prioridades</w:t>
       </w:r>
       <w:r>
+        <w:t>, pedir case de Copilot e preencher o quadro trimestre/semestre/ano.</w:t>
+      </w:r>
+    </w:p>
+    <w:p>
+      <w:r>
+        <w:t xml:space="preserve">→ </w:t>
+      </w:r>
+      <w:r>
         <w:rPr>
-          <w:rFonts w:ascii="Calibri" w:hAnsi="Calibri" w:eastAsia="Calibri"/>
-          <w:b w:val="0"/>
-          <w:i w:val="0"/>
-          <w:sz w:val="22"/>
+          <w:b/>
         </w:rPr>
-        <w:t>, pedir case de Copilot e preencher o quadro trimestre/semestre/ano.</w:t>
+        <w:t>Atualização:</w:t>
+      </w:r>
+      <w:r>
+        <w:t xml:space="preserve"> ver resumo da </w:t>
+      </w:r>
+      <w:r>
+        <w:rPr>
+          <w:b/>
+        </w:rPr>
+        <w:t>1:1 #2 (28/08)</w:t>
+      </w:r>
+      <w:r>
+        <w:t xml:space="preserve"> em </w:t>
+      </w:r>
+      <w:r>
+        <w:rPr>
+          <w:rFonts w:ascii="Consolas" w:hAnsi="Consolas"/>
+          <w:color w:val="333333"/>
+          <w:sz w:val="18"/>
+        </w:rPr>
+        <w:t>10-resumo-call-2.md</w:t>
+      </w:r>
+      <w:r>
+        <w:t>.</w:t>
       </w:r>
     </w:p>
     <w:p>
@@ -1265,12 +974,6 @@
     </w:p>
     <w:p>
       <w:r>
-        <w:rPr>
-          <w:rFonts w:ascii="Calibri" w:hAnsi="Calibri" w:eastAsia="Calibri"/>
-          <w:b w:val="0"/>
-          <w:i w:val="0"/>
-          <w:sz w:val="22"/>
-        </w:rPr>
         <w:t>Doc pronto com passo a passo na tela + textos para colar + Atualidade ≤150 caracteres:</w:t>
       </w:r>
     </w:p>
@@ -1279,19 +982,11 @@
         <w:pStyle w:val="ListBullet"/>
       </w:pPr>
       <w:r>
-        <w:rPr>
-          <w:rFonts w:ascii="Calibri" w:hAnsi="Calibri" w:eastAsia="Calibri"/>
-          <w:b w:val="0"/>
-          <w:i w:val="0"/>
-          <w:sz w:val="22"/>
-        </w:rPr>
         <w:t xml:space="preserve">Markdown: </w:t>
       </w:r>
       <w:r>
         <w:rPr>
-          <w:rFonts w:ascii="Consolas" w:hAnsi="Consolas" w:eastAsia="Consolas"/>
-          <w:b w:val="0"/>
-          <w:i w:val="0"/>
+          <w:rFonts w:ascii="Consolas" w:hAnsi="Consolas"/>
           <w:color w:val="333333"/>
           <w:sz w:val="18"/>
         </w:rPr>
@@ -1303,19 +998,11 @@
         <w:pStyle w:val="ListBullet"/>
       </w:pPr>
       <w:r>
-        <w:rPr>
-          <w:rFonts w:ascii="Calibri" w:hAnsi="Calibri" w:eastAsia="Calibri"/>
-          <w:b w:val="0"/>
-          <w:i w:val="0"/>
-          <w:sz w:val="22"/>
-        </w:rPr>
         <w:t xml:space="preserve">Word: </w:t>
       </w:r>
       <w:r>
         <w:rPr>
-          <w:rFonts w:ascii="Consolas" w:hAnsi="Consolas" w:eastAsia="Consolas"/>
-          <w:b w:val="0"/>
-          <w:i w:val="0"/>
+          <w:rFonts w:ascii="Consolas" w:hAnsi="Consolas"/>
           <w:color w:val="333333"/>
           <w:sz w:val="18"/>
         </w:rPr>
@@ -1324,82 +1011,42 @@
     </w:p>
     <w:p>
       <w:r>
-        <w:rPr>
-          <w:rFonts w:ascii="Calibri" w:hAnsi="Calibri" w:eastAsia="Calibri"/>
-          <w:b w:val="0"/>
-          <w:i w:val="0"/>
-          <w:sz w:val="22"/>
-        </w:rPr>
         <w:t xml:space="preserve">Resumo do caminho: Priorities Homepage → </w:t>
       </w:r>
       <w:r>
         <w:rPr>
-          <w:rFonts w:ascii="Calibri" w:hAnsi="Calibri" w:eastAsia="Calibri"/>
           <w:b/>
-          <w:i w:val="0"/>
-          <w:sz w:val="22"/>
         </w:rPr>
         <w:t>Edit &gt;</w:t>
       </w:r>
       <w:r>
-        <w:rPr>
-          <w:rFonts w:ascii="Calibri" w:hAnsi="Calibri" w:eastAsia="Calibri"/>
-          <w:b w:val="0"/>
-          <w:i w:val="0"/>
-          <w:sz w:val="22"/>
-        </w:rPr>
         <w:t xml:space="preserve"> → </w:t>
       </w:r>
       <w:r>
         <w:rPr>
-          <w:rFonts w:ascii="Calibri" w:hAnsi="Calibri" w:eastAsia="Calibri"/>
           <w:b/>
-          <w:i w:val="0"/>
-          <w:sz w:val="22"/>
         </w:rPr>
         <w:t>Submeta e Refleta</w:t>
       </w:r>
       <w:r>
-        <w:rPr>
-          <w:rFonts w:ascii="Calibri" w:hAnsi="Calibri" w:eastAsia="Calibri"/>
-          <w:b w:val="0"/>
-          <w:i w:val="0"/>
-          <w:sz w:val="22"/>
-        </w:rPr>
         <w:t xml:space="preserve"> → colar reflexão → slider → Atualidade (máx. 150) → </w:t>
       </w:r>
       <w:r>
         <w:rPr>
-          <w:rFonts w:ascii="Calibri" w:hAnsi="Calibri" w:eastAsia="Calibri"/>
           <w:b/>
-          <w:i w:val="0"/>
-          <w:sz w:val="22"/>
         </w:rPr>
         <w:t>Enviar</w:t>
       </w:r>
       <w:r>
-        <w:rPr>
-          <w:rFonts w:ascii="Calibri" w:hAnsi="Calibri" w:eastAsia="Calibri"/>
-          <w:b w:val="0"/>
-          <w:i w:val="0"/>
-          <w:sz w:val="22"/>
-        </w:rPr>
         <w:t>.</w:t>
       </w:r>
     </w:p>
     <w:p>
       <w:r>
-        <w:rPr>
-          <w:rFonts w:ascii="Calibri" w:hAnsi="Calibri" w:eastAsia="Calibri"/>
-          <w:b w:val="0"/>
-          <w:i w:val="0"/>
-          <w:sz w:val="22"/>
-        </w:rPr>
         <w:t>Agrupe as 7 metas em 4 categorias antes de refletir.</w:t>
       </w:r>
     </w:p>
     <w:sectPr>
-      <w:footerReference w:type="default" r:id="rId9"/>
       <w:pgSz w:w="12240" w:h="15840"/>
       <w:pgMar w:top="1134" w:right="1247" w:bottom="1134" w:left="1247" w:header="720" w:footer="720" w:gutter="0"/>
       <w:cols w:space="720"/>
@@ -1407,27 +1054,6 @@
     </w:sectPr>
   </w:body>
 </w:document>
-</file>
-
-<file path=word/footer1.xml><?xml version="1.0" encoding="utf-8"?>
-<w:ftr xmlns:m="http://schemas.openxmlformats.org/officeDocument/2006/math" xmlns:mc="http://schemas.openxmlformats.org/markup-compatibility/2006" xmlns:mo="http://schemas.microsoft.com/office/mac/office/2008/main" xmlns:mv="urn:schemas-microsoft-com:mac:vml" xmlns:o="urn:schemas-microsoft-com:office:office" xmlns:r="http://schemas.openxmlformats.org/officeDocument/2006/relationships" xmlns:v="urn:schemas-microsoft-com:vml" xmlns:w10="urn:schemas-microsoft-com:office:word" xmlns:w14="http://schemas.microsoft.com/office/word/2010/wordml" xmlns:w="http://schemas.openxmlformats.org/wordprocessingml/2006/main" xmlns:wne="http://schemas.microsoft.com/office/word/2006/wordml" xmlns:wp14="http://schemas.microsoft.com/office/word/2010/wordprocessingDrawing" xmlns:wp="http://schemas.openxmlformats.org/drawingml/2006/wordprocessingDrawing" xmlns:wpc="http://schemas.microsoft.com/office/word/2010/wordprocessingCanvas" xmlns:wpg="http://schemas.microsoft.com/office/word/2010/wordprocessingGroup" xmlns:wpi="http://schemas.microsoft.com/office/word/2010/wordprocessingInk" xmlns:wps="http://schemas.microsoft.com/office/word/2010/wordprocessingShape" mc:Ignorable="w14 wp14">
-  <w:p>
-    <w:pPr>
-      <w:pStyle w:val="Footer"/>
-      <w:jc w:val="center"/>
-    </w:pPr>
-    <w:r>
-      <w:rPr>
-        <w:rFonts w:ascii="Calibri" w:hAnsi="Calibri" w:eastAsia="Calibri"/>
-        <w:b w:val="0"/>
-        <w:i/>
-        <w:color w:val="555555"/>
-        <w:sz w:val="16"/>
-      </w:rPr>
-      <w:t>People Lead · Ana Karina · documento vivo · atualizar a cada 1:1</w:t>
-    </w:r>
-  </w:p>
-</w:ftr>
 </file>
 
 <file path=word/numbering.xml><?xml version="1.0" encoding="utf-8"?>

</xml_diff>